<commit_message>
Add visual website redesign and refresh deliverables
</commit_message>
<xml_diff>
--- a/docs/project_blueprints/North_Slope_Gas_Hydrate_Reservoir_Characterization_Research_Overview.docx
+++ b/docs/project_blueprints/North_Slope_Gas_Hydrate_Reservoir_Characterization_Research_Overview.docx
@@ -26,7 +26,7 @@
           <w:color w:val="5E6A71"/>
           <w:sz w:val="21"/>
         </w:rPr>
-        <w:t>Research-paper outline with filled abstract and introduction</w:t>
+        <w:t>Research-paper outline updated with website visuals and header-derived synthetic-data provenance</w:t>
       </w:r>
     </w:p>
     <w:tbl>
@@ -66,6 +66,49 @@
                 <w:sz w:val="18"/>
               </w:rPr>
               <w:t>Boundary: this public-source planning document contains no restricted well logs, approved-runtime data, named restricted well identifiers, populated model results, credentials, or sensitive derived outputs.</w:t>
+            </w:r>
+          </w:p>
+        </w:tc>
+      </w:tr>
+    </w:tbl>
+    <w:p/>
+    <w:tbl>
+      <w:tblPr>
+        <w:tblStyle w:val="TableGrid"/>
+        <w:tblW w:type="auto" w:w="0"/>
+        <w:tblLook w:firstColumn="1" w:firstRow="1" w:lastColumn="0" w:lastRow="0" w:noHBand="0" w:noVBand="1" w:val="04A0"/>
+        <w:tblBorders>
+          <w:top w:val="single" w:sz="4" w:space="0" w:color="D2C8B8"/>
+          <w:left w:val="single" w:sz="4" w:space="0" w:color="D2C8B8"/>
+          <w:bottom w:val="single" w:sz="4" w:space="0" w:color="D2C8B8"/>
+          <w:right w:val="single" w:sz="4" w:space="0" w:color="D2C8B8"/>
+          <w:insideH w:val="single" w:sz="4" w:space="0" w:color="D2C8B8"/>
+          <w:insideV w:val="single" w:sz="4" w:space="0" w:color="D2C8B8"/>
+        </w:tblBorders>
+      </w:tblPr>
+      <w:tblGrid>
+        <w:gridCol w:w="10080"/>
+      </w:tblGrid>
+      <w:tr>
+        <w:tc>
+          <w:tcPr>
+            <w:tcW w:type="dxa" w:w="10080"/>
+            <w:shd w:fill="F4EFE6"/>
+          </w:tcPr>
+          <w:p>
+            <w:pPr>
+              <w:spacing w:after="0" w:line="252" w:lineRule="auto"/>
+              <w:jc w:val="left"/>
+            </w:pPr>
+            <w:r/>
+            <w:r>
+              <w:rPr>
+                <w:rFonts w:ascii="Aptos" w:hAnsi="Aptos"/>
+                <w:b/>
+                <w:color w:val="123447"/>
+                <w:sz w:val="18"/>
+              </w:rPr>
+              <w:t>Header-derived synthetic records only: the user supplied Excel header/schema references, not real well-log rows. Values are generated placeholders for layout, validation, and visual QA.</w:t>
             </w:r>
           </w:p>
         </w:tc>
@@ -150,7 +193,7 @@
           <w:color w:val="1F2933"/>
           <w:sz w:val="20"/>
         </w:rPr>
-        <w:t>The project will use all available screenshot-listed fields and NMR where present. The expected input families include depth, location, gamma ray, density, density porosity, neutron porosity, NMR porosity, resistivity, caliper, Vp, Vs, Vp/Vs, acoustic impedance, interpreted hydrate saturation fields such as Sgh or S_h, NMR-derived saturation where supplied, core porosity, permeability, lithology, and quality flags. These variables are scientifically useful only when their roles are controlled. Measured curves, derived features, quality-control fields, alignment fields, and supervised targets must be separated so that the model does not accidentally learn from the answer column it is supposed to predict.</w:t>
+        <w:t>The current public scaffold is based on three Excel header/schema references, not real sample rows. Those headers indicate the expected input families: depth, location, gamma ray, density, density porosity, neutron porosity, NMR porosity, resistivity, caliper, Vp, Vs, Vp/Vs, acoustic impedance, interpreted hydrate saturation fields such as Sgh or S_h, NMR-derived saturation where supplied, core porosity, permeability, lithology, and quality flags. Synthetic rows may be generated from those headers to test layout, validation, and visual behavior, but the generated values are not scientific measurements. These variables are scientifically useful only when their roles are controlled. Measured curves, derived features, quality-control fields, alignment fields, and supervised targets must be separated so that the model does not accidentally learn from the answer column it is supposed to predict.</w:t>
       </w:r>
     </w:p>
     <w:p>
@@ -728,6 +771,208 @@
       </w:tr>
     </w:tbl>
     <w:p/>
+    <w:p>
+      <w:pPr>
+        <w:pStyle w:val="Heading3"/>
+      </w:pPr>
+      <w:r>
+        <w:t>Website visual workflow now implemented</w:t>
+      </w:r>
+    </w:p>
+    <w:tbl>
+      <w:tblPr>
+        <w:tblStyle w:val="TableGrid"/>
+        <w:tblW w:type="auto" w:w="0"/>
+        <w:tblLook w:firstColumn="1" w:firstRow="1" w:lastColumn="0" w:lastRow="0" w:noHBand="0" w:noVBand="1" w:val="04A0"/>
+        <w:tblBorders>
+          <w:top w:val="single" w:sz="4" w:space="0" w:color="C5D3D8"/>
+          <w:left w:val="single" w:sz="4" w:space="0" w:color="C5D3D8"/>
+          <w:bottom w:val="single" w:sz="4" w:space="0" w:color="C5D3D8"/>
+          <w:right w:val="single" w:sz="4" w:space="0" w:color="C5D3D8"/>
+          <w:insideH w:val="single" w:sz="4" w:space="0" w:color="C5D3D8"/>
+          <w:insideV w:val="single" w:sz="4" w:space="0" w:color="C5D3D8"/>
+        </w:tblBorders>
+      </w:tblPr>
+      <w:tblGrid>
+        <w:gridCol w:w="1440"/>
+        <w:gridCol w:w="1440"/>
+        <w:gridCol w:w="1440"/>
+        <w:gridCol w:w="1440"/>
+        <w:gridCol w:w="1440"/>
+        <w:gridCol w:w="1440"/>
+        <w:gridCol w:w="1440"/>
+      </w:tblGrid>
+      <w:tr>
+        <w:tc>
+          <w:tcPr>
+            <w:tcW w:type="dxa" w:w="1440"/>
+            <w:shd w:fill="EAF5F6"/>
+          </w:tcPr>
+          <w:p>
+            <w:pPr>
+              <w:spacing w:after="0" w:line="252" w:lineRule="auto"/>
+              <w:jc w:val="center"/>
+            </w:pPr>
+            <w:r/>
+            <w:r>
+              <w:rPr>
+                <w:rFonts w:ascii="Aptos" w:hAnsi="Aptos"/>
+                <w:b/>
+                <w:color w:val="123447"/>
+                <w:sz w:val="15"/>
+              </w:rPr>
+              <w:t>Overview</w:t>
+            </w:r>
+          </w:p>
+        </w:tc>
+        <w:tc>
+          <w:tcPr>
+            <w:tcW w:type="dxa" w:w="360"/>
+            <w:shd w:fill="FFFFFF"/>
+          </w:tcPr>
+          <w:p>
+            <w:pPr>
+              <w:spacing w:after="0" w:line="252" w:lineRule="auto"/>
+              <w:jc w:val="center"/>
+            </w:pPr>
+            <w:r/>
+            <w:r>
+              <w:rPr>
+                <w:rFonts w:ascii="Aptos" w:hAnsi="Aptos"/>
+                <w:b/>
+                <w:color w:val="167D8D"/>
+                <w:sz w:val="19"/>
+              </w:rPr>
+              <w:t>-&gt;</w:t>
+            </w:r>
+          </w:p>
+        </w:tc>
+        <w:tc>
+          <w:tcPr>
+            <w:tcW w:type="dxa" w:w="1440"/>
+            <w:shd w:fill="EAF5F6"/>
+          </w:tcPr>
+          <w:p>
+            <w:pPr>
+              <w:spacing w:after="0" w:line="252" w:lineRule="auto"/>
+              <w:jc w:val="center"/>
+            </w:pPr>
+            <w:r/>
+            <w:r>
+              <w:rPr>
+                <w:rFonts w:ascii="Aptos" w:hAnsi="Aptos"/>
+                <w:b/>
+                <w:color w:val="123447"/>
+                <w:sz w:val="15"/>
+              </w:rPr>
+              <w:t>Explore</w:t>
+            </w:r>
+          </w:p>
+        </w:tc>
+        <w:tc>
+          <w:tcPr>
+            <w:tcW w:type="dxa" w:w="360"/>
+            <w:shd w:fill="FFFFFF"/>
+          </w:tcPr>
+          <w:p>
+            <w:pPr>
+              <w:spacing w:after="0" w:line="252" w:lineRule="auto"/>
+              <w:jc w:val="center"/>
+            </w:pPr>
+            <w:r/>
+            <w:r>
+              <w:rPr>
+                <w:rFonts w:ascii="Aptos" w:hAnsi="Aptos"/>
+                <w:b/>
+                <w:color w:val="167D8D"/>
+                <w:sz w:val="19"/>
+              </w:rPr>
+              <w:t>-&gt;</w:t>
+            </w:r>
+          </w:p>
+        </w:tc>
+        <w:tc>
+          <w:tcPr>
+            <w:tcW w:type="dxa" w:w="1440"/>
+            <w:shd w:fill="EAF5F6"/>
+          </w:tcPr>
+          <w:p>
+            <w:pPr>
+              <w:spacing w:after="0" w:line="252" w:lineRule="auto"/>
+              <w:jc w:val="center"/>
+            </w:pPr>
+            <w:r/>
+            <w:r>
+              <w:rPr>
+                <w:rFonts w:ascii="Aptos" w:hAnsi="Aptos"/>
+                <w:b/>
+                <w:color w:val="123447"/>
+                <w:sz w:val="15"/>
+              </w:rPr>
+              <w:t>Analyze</w:t>
+            </w:r>
+          </w:p>
+        </w:tc>
+        <w:tc>
+          <w:tcPr>
+            <w:tcW w:type="dxa" w:w="360"/>
+            <w:shd w:fill="FFFFFF"/>
+          </w:tcPr>
+          <w:p>
+            <w:pPr>
+              <w:spacing w:after="0" w:line="252" w:lineRule="auto"/>
+              <w:jc w:val="center"/>
+            </w:pPr>
+            <w:r/>
+            <w:r>
+              <w:rPr>
+                <w:rFonts w:ascii="Aptos" w:hAnsi="Aptos"/>
+                <w:b/>
+                <w:color w:val="167D8D"/>
+                <w:sz w:val="19"/>
+              </w:rPr>
+              <w:t>-&gt;</w:t>
+            </w:r>
+          </w:p>
+        </w:tc>
+        <w:tc>
+          <w:tcPr>
+            <w:tcW w:type="dxa" w:w="1440"/>
+            <w:shd w:fill="EAF5F6"/>
+          </w:tcPr>
+          <w:p>
+            <w:pPr>
+              <w:spacing w:after="0" w:line="252" w:lineRule="auto"/>
+              <w:jc w:val="center"/>
+            </w:pPr>
+            <w:r/>
+            <w:r>
+              <w:rPr>
+                <w:rFonts w:ascii="Aptos" w:hAnsi="Aptos"/>
+                <w:b/>
+                <w:color w:val="123447"/>
+                <w:sz w:val="15"/>
+              </w:rPr>
+              <w:t>Project Plan</w:t>
+            </w:r>
+          </w:p>
+        </w:tc>
+      </w:tr>
+    </w:tbl>
+    <w:p/>
+    <w:p>
+      <w:pPr>
+        <w:spacing w:after="100" w:line="264" w:lineRule="auto"/>
+      </w:pPr>
+      <w:r>
+        <w:rPr>
+          <w:rFonts w:ascii="Aptos" w:hAnsi="Aptos"/>
+          <w:color w:val="1F2933"/>
+          <w:sz w:val="20"/>
+        </w:rPr>
+        <w:t>The Streamlit website has been reduced to four visual-first pages. It is a prototype and figure-generation surface for the Word document and PowerPoint. It should continue to show only public GIS layers and header-derived synthetic examples until approved data are loaded inside the authorized runtime environment.</w:t>
+      </w:r>
+    </w:p>
     <w:p>
       <w:pPr>
         <w:spacing w:after="100" w:line="264" w:lineRule="auto"/>
@@ -1334,6 +1579,79 @@
         <w:pStyle w:val="Heading1"/>
       </w:pPr>
       <w:r>
+        <w:t>Current Evidence Anchors</w:t>
+      </w:r>
+    </w:p>
+    <w:p>
+      <w:pPr>
+        <w:spacing w:after="100" w:line="264" w:lineRule="auto"/>
+      </w:pPr>
+      <w:r>
+        <w:rPr>
+          <w:rFonts w:ascii="Aptos" w:hAnsi="Aptos"/>
+          <w:color w:val="1F2933"/>
+          <w:sz w:val="20"/>
+        </w:rPr>
+        <w:t>ML inputs and saturation target design: Chong et al. (2022) - Density, porosity, resistivity, GR, Vp, Vs; NMR-density saturation reference; ANN baseline.</w:t>
+      </w:r>
+    </w:p>
+    <w:p>
+      <w:pPr>
+        <w:spacing w:after="100" w:line="264" w:lineRule="auto"/>
+      </w:pPr>
+      <w:r>
+        <w:rPr>
+          <w:rFonts w:ascii="Aptos" w:hAnsi="Aptos"/>
+          <w:color w:val="1F2933"/>
+          <w:sz w:val="20"/>
+        </w:rPr>
+        <w:t>NMR, sonic, and resistivity comparison: Lee and Collett (2011); Haines et al. (2022) - Cross-check saturation evidence and keep shale/tool effects visible.</w:t>
+      </w:r>
+    </w:p>
+    <w:p>
+      <w:pPr>
+        <w:spacing w:after="100" w:line="264" w:lineRule="auto"/>
+      </w:pPr>
+      <w:r>
+        <w:rPr>
+          <w:rFonts w:ascii="Aptos" w:hAnsi="Aptos"/>
+          <w:color w:val="1F2933"/>
+          <w:sz w:val="20"/>
+        </w:rPr>
+        <w:t>Good sand can remain no-hydrate: Zyrianova et al. (2024); USGS assessment sources - Compartmentalization, partial fill, water contacts, and charge/structure limits.</w:t>
+      </w:r>
+    </w:p>
+    <w:p>
+      <w:pPr>
+        <w:spacing w:after="100" w:line="264" w:lineRule="auto"/>
+      </w:pPr>
+      <w:r>
+        <w:rPr>
+          <w:rFonts w:ascii="Aptos" w:hAnsi="Aptos"/>
+          <w:color w:val="1F2933"/>
+          <w:sz w:val="20"/>
+        </w:rPr>
+        <w:t>Reservoir quality is separate from hydrate presence: Helmold and LePain (2023) - Texture, burial, porosity, permeability, and reservoir screening.</w:t>
+      </w:r>
+    </w:p>
+    <w:p>
+      <w:pPr>
+        <w:spacing w:after="100" w:line="264" w:lineRule="auto"/>
+      </w:pPr>
+      <w:r>
+        <w:rPr>
+          <w:rFonts w:ascii="Aptos" w:hAnsi="Aptos"/>
+          <w:color w:val="1F2933"/>
+          <w:sz w:val="20"/>
+        </w:rPr>
+        <w:t>Public maps constrain, not classify: USGS/Collett regional assessment sources - Regional petroleum-system framing without interval-scale hydrate labels.</w:t>
+      </w:r>
+    </w:p>
+    <w:p>
+      <w:pPr>
+        <w:pStyle w:val="Heading1"/>
+      </w:pPr>
+      <w:r>
         <w:t>Conclusion</w:t>
       </w:r>
     </w:p>

</xml_diff>